<commit_message>
fix(gpr): adicionar orçamento de horas ao template de plano de projeto
Inclui tabela de h por papel em §4 (GPR 4 — esforço estimado) e
bloco de orçamento total em §5 (GPR 5 — orçamento e cronograma).
Referência: 168 h/mês disponíveis → ~140 h/mês efetivas (~70 h/sprint/FTE)
após dedução de cerimônias ágeis (~15%). Fecha o finding GPR5.

https://claude.ai/code/session_011KXfcc9u9SbkrrmomU4zNq
</commit_message>
<xml_diff>
--- a/mps-nivel-c/oficial/03_templates/TPL-GPR-001_Template-Plano-de-Projeto.docx
+++ b/mps-nivel-c/oficial/03_templates/TPL-GPR-001_Template-Plano-de-Projeto.docx
@@ -1075,7 +1075,21 @@
           <w:i/>
           <w:sz w:val="22"/>
         </w:rPr>
-        <w:t>[Registre as estimativas de tamanho (story points) e a derivação de esforço/prazo a partir da velocity. Indique a base histórica usada.]</w:t>
+        <w:t>[Registre as estimativas de tamanho (story points), a derivação de esforço/prazo e o orçamento de horas por papel. Indique a base histórica usada.]</w:t>
+      </w:r>
+    </w:p>
+    <w:p>
+      <w:pPr>
+        <w:spacing w:before="0" w:after="120"/>
+      </w:pPr>
+      <w:r>
+        <w:rPr>
+          <w:rFonts w:ascii="Calibri" w:hAnsi="Calibri"/>
+          <w:b/>
+          <w:i w:val="0"/>
+          <w:sz w:val="22"/>
+        </w:rPr>
+        <w:t>Tamanho e prazo</w:t>
       </w:r>
     </w:p>
     <w:p>
@@ -1138,7 +1152,7 @@
           <w:i w:val="0"/>
           <w:sz w:val="22"/>
         </w:rPr>
-        <w:t>Esforço/prazo estimado:</w:t>
+        <w:t>Número de sprints estimado:</w:t>
       </w:r>
       <w:r>
         <w:rPr>
@@ -1147,7 +1161,31 @@
           <w:i w:val="0"/>
           <w:sz w:val="22"/>
         </w:rPr>
-        <w:t xml:space="preserve"> [nº de sprints / período]</w:t>
+        <w:t xml:space="preserve"> [nº]</w:t>
+      </w:r>
+    </w:p>
+    <w:p>
+      <w:pPr>
+        <w:pStyle w:val="ListBullet"/>
+        <w:spacing w:before="20" w:after="40"/>
+      </w:pPr>
+      <w:r>
+        <w:rPr>
+          <w:rFonts w:ascii="Calibri" w:hAnsi="Calibri"/>
+          <w:b/>
+          <w:i w:val="0"/>
+          <w:sz w:val="22"/>
+        </w:rPr>
+        <w:t>Duração estimada:</w:t>
+      </w:r>
+      <w:r>
+        <w:rPr>
+          <w:rFonts w:ascii="Calibri" w:hAnsi="Calibri"/>
+          <w:b w:val="0"/>
+          <w:i w:val="0"/>
+          <w:sz w:val="22"/>
+        </w:rPr>
+        <w:t xml:space="preserve"> [período — ex.: 4 meses / jul–out/2026]</w:t>
       </w:r>
     </w:p>
     <w:p>
@@ -1176,15 +1214,16 @@
     </w:p>
     <w:p>
       <w:pPr>
-        <w:pStyle w:val="Heading1"/>
-        <w:keepNext/>
-        <w:keepLines/>
-        <w:pBdr>
-          <w:bottom w:val="single" w:sz="4" w:space="2" w:color="D6E4F0"/>
-        </w:pBdr>
+        <w:spacing w:before="0" w:after="120"/>
       </w:pPr>
       <w:r>
-        <w:t>5. Cronograma e marcos (GPR 5)</w:t>
+        <w:rPr>
+          <w:rFonts w:ascii="Calibri" w:hAnsi="Calibri"/>
+          <w:b/>
+          <w:i w:val="0"/>
+          <w:sz w:val="22"/>
+        </w:rPr>
+        <w:t>Orçamento de horas por papel</w:t>
       </w:r>
     </w:p>
     <w:p>
@@ -1198,7 +1237,1219 @@
           <w:i/>
           <w:sz w:val="22"/>
         </w:rPr>
-        <w:t>[Liste os marcos do projeto e as sprints previstas.]</w:t>
+        <w:t xml:space="preserve">[Calcule as horas por papel usando a referência: 168 h/mês disponíveis por pessoa (21 dias × 8 h); deduzindo ~28 h de cerimônias ágeis e reuniões internas (~15%), a capacidade efetiva de projeto é de </w:t>
+      </w:r>
+      <w:r>
+        <w:rPr>
+          <w:rFonts w:ascii="Calibri" w:hAnsi="Calibri"/>
+          <w:b w:val="0"/>
+          <w:i/>
+          <w:sz w:val="22"/>
+        </w:rPr>
+        <w:t>140 h/mês por FTE</w:t>
+      </w:r>
+      <w:r>
+        <w:rPr>
+          <w:rFonts w:ascii="Calibri" w:hAnsi="Calibri"/>
+          <w:b w:val="0"/>
+          <w:i/>
+          <w:sz w:val="22"/>
+        </w:rPr>
+        <w:t xml:space="preserve"> ou </w:t>
+      </w:r>
+      <w:r>
+        <w:rPr>
+          <w:rFonts w:ascii="Calibri" w:hAnsi="Calibri"/>
+          <w:b w:val="0"/>
+          <w:i/>
+          <w:sz w:val="22"/>
+        </w:rPr>
+        <w:t>70 h por sprint de 2 semanas por FTE</w:t>
+      </w:r>
+      <w:r>
+        <w:rPr>
+          <w:rFonts w:ascii="Calibri" w:hAnsi="Calibri"/>
+          <w:b w:val="0"/>
+          <w:i/>
+          <w:sz w:val="22"/>
+        </w:rPr>
+        <w:t>. Ajuste pela % de dedicação ao projeto.]</w:t>
+      </w:r>
+    </w:p>
+    <w:tbl>
+      <w:tblPr>
+        <w:tblW w:type="auto" w:w="0"/>
+        <w:tblLook w:firstColumn="1" w:firstRow="1" w:lastColumn="0" w:lastRow="0" w:noHBand="0" w:noVBand="1" w:val="04A0"/>
+        <w:tblBorders>
+          <w:top w:val="single" w:sz="4" w:space="0" w:color="003366"/>
+          <w:left w:val="single" w:sz="4" w:space="0" w:color="003366"/>
+          <w:bottom w:val="single" w:sz="4" w:space="0" w:color="003366"/>
+          <w:right w:val="single" w:sz="4" w:space="0" w:color="003366"/>
+          <w:insideH w:val="single" w:sz="4" w:space="0" w:color="003366"/>
+          <w:insideV w:val="single" w:sz="4" w:space="0" w:color="003366"/>
+        </w:tblBorders>
+      </w:tblPr>
+      <w:tblGrid>
+        <w:gridCol w:w="1484"/>
+        <w:gridCol w:w="1484"/>
+        <w:gridCol w:w="1484"/>
+        <w:gridCol w:w="1484"/>
+        <w:gridCol w:w="1484"/>
+        <w:gridCol w:w="1484"/>
+      </w:tblGrid>
+      <w:tr>
+        <w:trPr>
+          <w:cantSplit w:val="1"/>
+        </w:trPr>
+        <w:tc>
+          <w:tcPr>
+            <w:tcW w:type="dxa" w:w="1484"/>
+            <w:tcMar>
+              <w:top w:w="60" w:type="dxa"/>
+              <w:bottom w:w="60" w:type="dxa"/>
+              <w:left w:w="100" w:type="dxa"/>
+              <w:right w:w="100" w:type="dxa"/>
+            </w:tcMar>
+            <w:shd w:val="clear" w:color="auto" w:fill="003366"/>
+          </w:tcPr>
+          <w:p>
+            <w:pPr>
+              <w:spacing w:before="40" w:after="40"/>
+            </w:pPr>
+            <w:r>
+              <w:rPr>
+                <w:rFonts w:ascii="Calibri" w:hAnsi="Calibri"/>
+                <w:b/>
+                <w:i w:val="0"/>
+                <w:color w:val="FFFFFF"/>
+                <w:sz w:val="20"/>
+              </w:rPr>
+              <w:t>Papel</w:t>
+            </w:r>
+          </w:p>
+        </w:tc>
+        <w:tc>
+          <w:tcPr>
+            <w:tcW w:type="dxa" w:w="1484"/>
+            <w:tcMar>
+              <w:top w:w="60" w:type="dxa"/>
+              <w:bottom w:w="60" w:type="dxa"/>
+              <w:left w:w="100" w:type="dxa"/>
+              <w:right w:w="100" w:type="dxa"/>
+            </w:tcMar>
+            <w:shd w:val="clear" w:color="auto" w:fill="003366"/>
+          </w:tcPr>
+          <w:p>
+            <w:pPr>
+              <w:spacing w:before="40" w:after="40"/>
+            </w:pPr>
+            <w:r>
+              <w:rPr>
+                <w:rFonts w:ascii="Calibri" w:hAnsi="Calibri"/>
+                <w:b/>
+                <w:i w:val="0"/>
+                <w:color w:val="FFFFFF"/>
+                <w:sz w:val="20"/>
+              </w:rPr>
+              <w:t>Pessoas</w:t>
+            </w:r>
+          </w:p>
+        </w:tc>
+        <w:tc>
+          <w:tcPr>
+            <w:tcW w:type="dxa" w:w="1484"/>
+            <w:tcMar>
+              <w:top w:w="60" w:type="dxa"/>
+              <w:bottom w:w="60" w:type="dxa"/>
+              <w:left w:w="100" w:type="dxa"/>
+              <w:right w:w="100" w:type="dxa"/>
+            </w:tcMar>
+            <w:shd w:val="clear" w:color="auto" w:fill="003366"/>
+          </w:tcPr>
+          <w:p>
+            <w:pPr>
+              <w:spacing w:before="40" w:after="40"/>
+            </w:pPr>
+            <w:r>
+              <w:rPr>
+                <w:rFonts w:ascii="Calibri" w:hAnsi="Calibri"/>
+                <w:b/>
+                <w:i w:val="0"/>
+                <w:color w:val="FFFFFF"/>
+                <w:sz w:val="20"/>
+              </w:rPr>
+              <w:t>Dedicação</w:t>
+            </w:r>
+          </w:p>
+        </w:tc>
+        <w:tc>
+          <w:tcPr>
+            <w:tcW w:type="dxa" w:w="1484"/>
+            <w:tcMar>
+              <w:top w:w="60" w:type="dxa"/>
+              <w:bottom w:w="60" w:type="dxa"/>
+              <w:left w:w="100" w:type="dxa"/>
+              <w:right w:w="100" w:type="dxa"/>
+            </w:tcMar>
+            <w:shd w:val="clear" w:color="auto" w:fill="003366"/>
+          </w:tcPr>
+          <w:p>
+            <w:pPr>
+              <w:spacing w:before="40" w:after="40"/>
+            </w:pPr>
+            <w:r>
+              <w:rPr>
+                <w:rFonts w:ascii="Calibri" w:hAnsi="Calibri"/>
+                <w:b/>
+                <w:i w:val="0"/>
+                <w:color w:val="FFFFFF"/>
+                <w:sz w:val="20"/>
+              </w:rPr>
+              <w:t>h efetivas/sprint</w:t>
+            </w:r>
+          </w:p>
+        </w:tc>
+        <w:tc>
+          <w:tcPr>
+            <w:tcW w:type="dxa" w:w="1484"/>
+            <w:tcMar>
+              <w:top w:w="60" w:type="dxa"/>
+              <w:bottom w:w="60" w:type="dxa"/>
+              <w:left w:w="100" w:type="dxa"/>
+              <w:right w:w="100" w:type="dxa"/>
+            </w:tcMar>
+            <w:shd w:val="clear" w:color="auto" w:fill="003366"/>
+          </w:tcPr>
+          <w:p>
+            <w:pPr>
+              <w:spacing w:before="40" w:after="40"/>
+            </w:pPr>
+            <w:r>
+              <w:rPr>
+                <w:rFonts w:ascii="Calibri" w:hAnsi="Calibri"/>
+                <w:b/>
+                <w:i w:val="0"/>
+                <w:color w:val="FFFFFF"/>
+                <w:sz w:val="20"/>
+              </w:rPr>
+              <w:t>Nº sprints</w:t>
+            </w:r>
+          </w:p>
+        </w:tc>
+        <w:tc>
+          <w:tcPr>
+            <w:tcW w:type="dxa" w:w="1484"/>
+            <w:tcMar>
+              <w:top w:w="60" w:type="dxa"/>
+              <w:bottom w:w="60" w:type="dxa"/>
+              <w:left w:w="100" w:type="dxa"/>
+              <w:right w:w="100" w:type="dxa"/>
+            </w:tcMar>
+            <w:shd w:val="clear" w:color="auto" w:fill="003366"/>
+          </w:tcPr>
+          <w:p>
+            <w:pPr>
+              <w:spacing w:before="40" w:after="40"/>
+            </w:pPr>
+            <w:r>
+              <w:rPr>
+                <w:rFonts w:ascii="Calibri" w:hAnsi="Calibri"/>
+                <w:b/>
+                <w:i w:val="0"/>
+                <w:color w:val="FFFFFF"/>
+                <w:sz w:val="20"/>
+              </w:rPr>
+              <w:t>h estimadas</w:t>
+            </w:r>
+          </w:p>
+        </w:tc>
+      </w:tr>
+      <w:tr>
+        <w:trPr>
+          <w:cantSplit w:val="1"/>
+        </w:trPr>
+        <w:tc>
+          <w:tcPr>
+            <w:tcW w:type="dxa" w:w="1484"/>
+            <w:tcMar>
+              <w:top w:w="60" w:type="dxa"/>
+              <w:bottom w:w="60" w:type="dxa"/>
+              <w:left w:w="100" w:type="dxa"/>
+              <w:right w:w="100" w:type="dxa"/>
+            </w:tcMar>
+            <w:shd w:val="clear" w:color="auto" w:fill="EBF5FB"/>
+          </w:tcPr>
+          <w:p>
+            <w:pPr>
+              <w:spacing w:before="40" w:after="40"/>
+            </w:pPr>
+            <w:r>
+              <w:rPr>
+                <w:rFonts w:ascii="Calibri" w:hAnsi="Calibri"/>
+                <w:b w:val="0"/>
+                <w:i w:val="0"/>
+                <w:sz w:val="20"/>
+              </w:rPr>
+              <w:t>Gerente de Projeto / PO</w:t>
+            </w:r>
+          </w:p>
+        </w:tc>
+        <w:tc>
+          <w:tcPr>
+            <w:tcW w:type="dxa" w:w="1484"/>
+            <w:tcMar>
+              <w:top w:w="60" w:type="dxa"/>
+              <w:bottom w:w="60" w:type="dxa"/>
+              <w:left w:w="100" w:type="dxa"/>
+              <w:right w:w="100" w:type="dxa"/>
+            </w:tcMar>
+            <w:shd w:val="clear" w:color="auto" w:fill="EBF5FB"/>
+          </w:tcPr>
+          <w:p>
+            <w:pPr>
+              <w:spacing w:before="40" w:after="40"/>
+            </w:pPr>
+            <w:r>
+              <w:rPr>
+                <w:rFonts w:ascii="Calibri" w:hAnsi="Calibri"/>
+                <w:b w:val="0"/>
+                <w:i w:val="0"/>
+                <w:sz w:val="20"/>
+              </w:rPr>
+              <w:t>[n]</w:t>
+            </w:r>
+          </w:p>
+        </w:tc>
+        <w:tc>
+          <w:tcPr>
+            <w:tcW w:type="dxa" w:w="1484"/>
+            <w:tcMar>
+              <w:top w:w="60" w:type="dxa"/>
+              <w:bottom w:w="60" w:type="dxa"/>
+              <w:left w:w="100" w:type="dxa"/>
+              <w:right w:w="100" w:type="dxa"/>
+            </w:tcMar>
+            <w:shd w:val="clear" w:color="auto" w:fill="EBF5FB"/>
+          </w:tcPr>
+          <w:p>
+            <w:pPr>
+              <w:spacing w:before="40" w:after="40"/>
+            </w:pPr>
+            <w:r>
+              <w:rPr>
+                <w:rFonts w:ascii="Calibri" w:hAnsi="Calibri"/>
+                <w:b w:val="0"/>
+                <w:i w:val="0"/>
+                <w:sz w:val="20"/>
+              </w:rPr>
+              <w:t>[ex.: 60%]</w:t>
+            </w:r>
+          </w:p>
+        </w:tc>
+        <w:tc>
+          <w:tcPr>
+            <w:tcW w:type="dxa" w:w="1484"/>
+            <w:tcMar>
+              <w:top w:w="60" w:type="dxa"/>
+              <w:bottom w:w="60" w:type="dxa"/>
+              <w:left w:w="100" w:type="dxa"/>
+              <w:right w:w="100" w:type="dxa"/>
+            </w:tcMar>
+            <w:shd w:val="clear" w:color="auto" w:fill="EBF5FB"/>
+          </w:tcPr>
+          <w:p>
+            <w:pPr>
+              <w:spacing w:before="40" w:after="40"/>
+            </w:pPr>
+            <w:r>
+              <w:rPr>
+                <w:rFonts w:ascii="Calibri" w:hAnsi="Calibri"/>
+                <w:b w:val="0"/>
+                <w:i w:val="0"/>
+                <w:sz w:val="20"/>
+              </w:rPr>
+              <w:t>[ex.: 42 h]</w:t>
+            </w:r>
+          </w:p>
+        </w:tc>
+        <w:tc>
+          <w:tcPr>
+            <w:tcW w:type="dxa" w:w="1484"/>
+            <w:tcMar>
+              <w:top w:w="60" w:type="dxa"/>
+              <w:bottom w:w="60" w:type="dxa"/>
+              <w:left w:w="100" w:type="dxa"/>
+              <w:right w:w="100" w:type="dxa"/>
+            </w:tcMar>
+            <w:shd w:val="clear" w:color="auto" w:fill="EBF5FB"/>
+          </w:tcPr>
+          <w:p>
+            <w:pPr>
+              <w:spacing w:before="40" w:after="40"/>
+            </w:pPr>
+            <w:r>
+              <w:rPr>
+                <w:rFonts w:ascii="Calibri" w:hAnsi="Calibri"/>
+                <w:b w:val="0"/>
+                <w:i w:val="0"/>
+                <w:sz w:val="20"/>
+              </w:rPr>
+              <w:t>[n]</w:t>
+            </w:r>
+          </w:p>
+        </w:tc>
+        <w:tc>
+          <w:tcPr>
+            <w:tcW w:type="dxa" w:w="1484"/>
+            <w:tcMar>
+              <w:top w:w="60" w:type="dxa"/>
+              <w:bottom w:w="60" w:type="dxa"/>
+              <w:left w:w="100" w:type="dxa"/>
+              <w:right w:w="100" w:type="dxa"/>
+            </w:tcMar>
+            <w:shd w:val="clear" w:color="auto" w:fill="EBF5FB"/>
+          </w:tcPr>
+          <w:p>
+            <w:pPr>
+              <w:spacing w:before="40" w:after="40"/>
+            </w:pPr>
+            <w:r>
+              <w:rPr>
+                <w:rFonts w:ascii="Calibri" w:hAnsi="Calibri"/>
+                <w:b w:val="0"/>
+                <w:i w:val="0"/>
+                <w:sz w:val="20"/>
+              </w:rPr>
+              <w:t>[total]</w:t>
+            </w:r>
+          </w:p>
+        </w:tc>
+      </w:tr>
+      <w:tr>
+        <w:trPr>
+          <w:cantSplit w:val="1"/>
+        </w:trPr>
+        <w:tc>
+          <w:tcPr>
+            <w:tcW w:type="dxa" w:w="1484"/>
+            <w:tcMar>
+              <w:top w:w="60" w:type="dxa"/>
+              <w:bottom w:w="60" w:type="dxa"/>
+              <w:left w:w="100" w:type="dxa"/>
+              <w:right w:w="100" w:type="dxa"/>
+            </w:tcMar>
+          </w:tcPr>
+          <w:p>
+            <w:pPr>
+              <w:spacing w:before="40" w:after="40"/>
+            </w:pPr>
+            <w:r>
+              <w:rPr>
+                <w:rFonts w:ascii="Calibri" w:hAnsi="Calibri"/>
+                <w:b w:val="0"/>
+                <w:i w:val="0"/>
+                <w:sz w:val="20"/>
+              </w:rPr>
+              <w:t>Tech Lead / Arquiteto</w:t>
+            </w:r>
+          </w:p>
+        </w:tc>
+        <w:tc>
+          <w:tcPr>
+            <w:tcW w:type="dxa" w:w="1484"/>
+            <w:tcMar>
+              <w:top w:w="60" w:type="dxa"/>
+              <w:bottom w:w="60" w:type="dxa"/>
+              <w:left w:w="100" w:type="dxa"/>
+              <w:right w:w="100" w:type="dxa"/>
+            </w:tcMar>
+          </w:tcPr>
+          <w:p>
+            <w:pPr>
+              <w:spacing w:before="40" w:after="40"/>
+            </w:pPr>
+            <w:r>
+              <w:rPr>
+                <w:rFonts w:ascii="Calibri" w:hAnsi="Calibri"/>
+                <w:b w:val="0"/>
+                <w:i w:val="0"/>
+                <w:sz w:val="20"/>
+              </w:rPr>
+              <w:t>[n]</w:t>
+            </w:r>
+          </w:p>
+        </w:tc>
+        <w:tc>
+          <w:tcPr>
+            <w:tcW w:type="dxa" w:w="1484"/>
+            <w:tcMar>
+              <w:top w:w="60" w:type="dxa"/>
+              <w:bottom w:w="60" w:type="dxa"/>
+              <w:left w:w="100" w:type="dxa"/>
+              <w:right w:w="100" w:type="dxa"/>
+            </w:tcMar>
+          </w:tcPr>
+          <w:p>
+            <w:pPr>
+              <w:spacing w:before="40" w:after="40"/>
+            </w:pPr>
+            <w:r>
+              <w:rPr>
+                <w:rFonts w:ascii="Calibri" w:hAnsi="Calibri"/>
+                <w:b w:val="0"/>
+                <w:i w:val="0"/>
+                <w:sz w:val="20"/>
+              </w:rPr>
+              <w:t>[ex.: 80%]</w:t>
+            </w:r>
+          </w:p>
+        </w:tc>
+        <w:tc>
+          <w:tcPr>
+            <w:tcW w:type="dxa" w:w="1484"/>
+            <w:tcMar>
+              <w:top w:w="60" w:type="dxa"/>
+              <w:bottom w:w="60" w:type="dxa"/>
+              <w:left w:w="100" w:type="dxa"/>
+              <w:right w:w="100" w:type="dxa"/>
+            </w:tcMar>
+          </w:tcPr>
+          <w:p>
+            <w:pPr>
+              <w:spacing w:before="40" w:after="40"/>
+            </w:pPr>
+            <w:r>
+              <w:rPr>
+                <w:rFonts w:ascii="Calibri" w:hAnsi="Calibri"/>
+                <w:b w:val="0"/>
+                <w:i w:val="0"/>
+                <w:sz w:val="20"/>
+              </w:rPr>
+              <w:t>[ex.: 56 h]</w:t>
+            </w:r>
+          </w:p>
+        </w:tc>
+        <w:tc>
+          <w:tcPr>
+            <w:tcW w:type="dxa" w:w="1484"/>
+            <w:tcMar>
+              <w:top w:w="60" w:type="dxa"/>
+              <w:bottom w:w="60" w:type="dxa"/>
+              <w:left w:w="100" w:type="dxa"/>
+              <w:right w:w="100" w:type="dxa"/>
+            </w:tcMar>
+          </w:tcPr>
+          <w:p>
+            <w:pPr>
+              <w:spacing w:before="40" w:after="40"/>
+            </w:pPr>
+            <w:r>
+              <w:rPr>
+                <w:rFonts w:ascii="Calibri" w:hAnsi="Calibri"/>
+                <w:b w:val="0"/>
+                <w:i w:val="0"/>
+                <w:sz w:val="20"/>
+              </w:rPr>
+              <w:t>[n]</w:t>
+            </w:r>
+          </w:p>
+        </w:tc>
+        <w:tc>
+          <w:tcPr>
+            <w:tcW w:type="dxa" w:w="1484"/>
+            <w:tcMar>
+              <w:top w:w="60" w:type="dxa"/>
+              <w:bottom w:w="60" w:type="dxa"/>
+              <w:left w:w="100" w:type="dxa"/>
+              <w:right w:w="100" w:type="dxa"/>
+            </w:tcMar>
+          </w:tcPr>
+          <w:p>
+            <w:pPr>
+              <w:spacing w:before="40" w:after="40"/>
+            </w:pPr>
+            <w:r>
+              <w:rPr>
+                <w:rFonts w:ascii="Calibri" w:hAnsi="Calibri"/>
+                <w:b w:val="0"/>
+                <w:i w:val="0"/>
+                <w:sz w:val="20"/>
+              </w:rPr>
+              <w:t>[total]</w:t>
+            </w:r>
+          </w:p>
+        </w:tc>
+      </w:tr>
+      <w:tr>
+        <w:trPr>
+          <w:cantSplit w:val="1"/>
+        </w:trPr>
+        <w:tc>
+          <w:tcPr>
+            <w:tcW w:type="dxa" w:w="1484"/>
+            <w:tcMar>
+              <w:top w:w="60" w:type="dxa"/>
+              <w:bottom w:w="60" w:type="dxa"/>
+              <w:left w:w="100" w:type="dxa"/>
+              <w:right w:w="100" w:type="dxa"/>
+            </w:tcMar>
+            <w:shd w:val="clear" w:color="auto" w:fill="EBF5FB"/>
+          </w:tcPr>
+          <w:p>
+            <w:pPr>
+              <w:spacing w:before="40" w:after="40"/>
+            </w:pPr>
+            <w:r>
+              <w:rPr>
+                <w:rFonts w:ascii="Calibri" w:hAnsi="Calibri"/>
+                <w:b w:val="0"/>
+                <w:i w:val="0"/>
+                <w:sz w:val="20"/>
+              </w:rPr>
+              <w:t>Desenvolvedor</w:t>
+            </w:r>
+          </w:p>
+        </w:tc>
+        <w:tc>
+          <w:tcPr>
+            <w:tcW w:type="dxa" w:w="1484"/>
+            <w:tcMar>
+              <w:top w:w="60" w:type="dxa"/>
+              <w:bottom w:w="60" w:type="dxa"/>
+              <w:left w:w="100" w:type="dxa"/>
+              <w:right w:w="100" w:type="dxa"/>
+            </w:tcMar>
+            <w:shd w:val="clear" w:color="auto" w:fill="EBF5FB"/>
+          </w:tcPr>
+          <w:p>
+            <w:pPr>
+              <w:spacing w:before="40" w:after="40"/>
+            </w:pPr>
+            <w:r>
+              <w:rPr>
+                <w:rFonts w:ascii="Calibri" w:hAnsi="Calibri"/>
+                <w:b w:val="0"/>
+                <w:i w:val="0"/>
+                <w:sz w:val="20"/>
+              </w:rPr>
+              <w:t>[n]</w:t>
+            </w:r>
+          </w:p>
+        </w:tc>
+        <w:tc>
+          <w:tcPr>
+            <w:tcW w:type="dxa" w:w="1484"/>
+            <w:tcMar>
+              <w:top w:w="60" w:type="dxa"/>
+              <w:bottom w:w="60" w:type="dxa"/>
+              <w:left w:w="100" w:type="dxa"/>
+              <w:right w:w="100" w:type="dxa"/>
+            </w:tcMar>
+            <w:shd w:val="clear" w:color="auto" w:fill="EBF5FB"/>
+          </w:tcPr>
+          <w:p>
+            <w:pPr>
+              <w:spacing w:before="40" w:after="40"/>
+            </w:pPr>
+            <w:r>
+              <w:rPr>
+                <w:rFonts w:ascii="Calibri" w:hAnsi="Calibri"/>
+                <w:b w:val="0"/>
+                <w:i w:val="0"/>
+                <w:sz w:val="20"/>
+              </w:rPr>
+              <w:t>[ex.: 100%]</w:t>
+            </w:r>
+          </w:p>
+        </w:tc>
+        <w:tc>
+          <w:tcPr>
+            <w:tcW w:type="dxa" w:w="1484"/>
+            <w:tcMar>
+              <w:top w:w="60" w:type="dxa"/>
+              <w:bottom w:w="60" w:type="dxa"/>
+              <w:left w:w="100" w:type="dxa"/>
+              <w:right w:w="100" w:type="dxa"/>
+            </w:tcMar>
+            <w:shd w:val="clear" w:color="auto" w:fill="EBF5FB"/>
+          </w:tcPr>
+          <w:p>
+            <w:pPr>
+              <w:spacing w:before="40" w:after="40"/>
+            </w:pPr>
+            <w:r>
+              <w:rPr>
+                <w:rFonts w:ascii="Calibri" w:hAnsi="Calibri"/>
+                <w:b w:val="0"/>
+                <w:i w:val="0"/>
+                <w:sz w:val="20"/>
+              </w:rPr>
+              <w:t>[ex.: 70 h]</w:t>
+            </w:r>
+          </w:p>
+        </w:tc>
+        <w:tc>
+          <w:tcPr>
+            <w:tcW w:type="dxa" w:w="1484"/>
+            <w:tcMar>
+              <w:top w:w="60" w:type="dxa"/>
+              <w:bottom w:w="60" w:type="dxa"/>
+              <w:left w:w="100" w:type="dxa"/>
+              <w:right w:w="100" w:type="dxa"/>
+            </w:tcMar>
+            <w:shd w:val="clear" w:color="auto" w:fill="EBF5FB"/>
+          </w:tcPr>
+          <w:p>
+            <w:pPr>
+              <w:spacing w:before="40" w:after="40"/>
+            </w:pPr>
+            <w:r>
+              <w:rPr>
+                <w:rFonts w:ascii="Calibri" w:hAnsi="Calibri"/>
+                <w:b w:val="0"/>
+                <w:i w:val="0"/>
+                <w:sz w:val="20"/>
+              </w:rPr>
+              <w:t>[n]</w:t>
+            </w:r>
+          </w:p>
+        </w:tc>
+        <w:tc>
+          <w:tcPr>
+            <w:tcW w:type="dxa" w:w="1484"/>
+            <w:tcMar>
+              <w:top w:w="60" w:type="dxa"/>
+              <w:bottom w:w="60" w:type="dxa"/>
+              <w:left w:w="100" w:type="dxa"/>
+              <w:right w:w="100" w:type="dxa"/>
+            </w:tcMar>
+            <w:shd w:val="clear" w:color="auto" w:fill="EBF5FB"/>
+          </w:tcPr>
+          <w:p>
+            <w:pPr>
+              <w:spacing w:before="40" w:after="40"/>
+            </w:pPr>
+            <w:r>
+              <w:rPr>
+                <w:rFonts w:ascii="Calibri" w:hAnsi="Calibri"/>
+                <w:b w:val="0"/>
+                <w:i w:val="0"/>
+                <w:sz w:val="20"/>
+              </w:rPr>
+              <w:t>[total]</w:t>
+            </w:r>
+          </w:p>
+        </w:tc>
+      </w:tr>
+      <w:tr>
+        <w:trPr>
+          <w:cantSplit w:val="1"/>
+        </w:trPr>
+        <w:tc>
+          <w:tcPr>
+            <w:tcW w:type="dxa" w:w="1484"/>
+            <w:tcMar>
+              <w:top w:w="60" w:type="dxa"/>
+              <w:bottom w:w="60" w:type="dxa"/>
+              <w:left w:w="100" w:type="dxa"/>
+              <w:right w:w="100" w:type="dxa"/>
+            </w:tcMar>
+          </w:tcPr>
+          <w:p>
+            <w:pPr>
+              <w:spacing w:before="40" w:after="40"/>
+            </w:pPr>
+            <w:r>
+              <w:rPr>
+                <w:rFonts w:ascii="Calibri" w:hAnsi="Calibri"/>
+                <w:b w:val="0"/>
+                <w:i w:val="0"/>
+                <w:sz w:val="20"/>
+              </w:rPr>
+              <w:t>QA</w:t>
+            </w:r>
+          </w:p>
+        </w:tc>
+        <w:tc>
+          <w:tcPr>
+            <w:tcW w:type="dxa" w:w="1484"/>
+            <w:tcMar>
+              <w:top w:w="60" w:type="dxa"/>
+              <w:bottom w:w="60" w:type="dxa"/>
+              <w:left w:w="100" w:type="dxa"/>
+              <w:right w:w="100" w:type="dxa"/>
+            </w:tcMar>
+          </w:tcPr>
+          <w:p>
+            <w:pPr>
+              <w:spacing w:before="40" w:after="40"/>
+            </w:pPr>
+            <w:r>
+              <w:rPr>
+                <w:rFonts w:ascii="Calibri" w:hAnsi="Calibri"/>
+                <w:b w:val="0"/>
+                <w:i w:val="0"/>
+                <w:sz w:val="20"/>
+              </w:rPr>
+              <w:t>[n]</w:t>
+            </w:r>
+          </w:p>
+        </w:tc>
+        <w:tc>
+          <w:tcPr>
+            <w:tcW w:type="dxa" w:w="1484"/>
+            <w:tcMar>
+              <w:top w:w="60" w:type="dxa"/>
+              <w:bottom w:w="60" w:type="dxa"/>
+              <w:left w:w="100" w:type="dxa"/>
+              <w:right w:w="100" w:type="dxa"/>
+            </w:tcMar>
+          </w:tcPr>
+          <w:p>
+            <w:pPr>
+              <w:spacing w:before="40" w:after="40"/>
+            </w:pPr>
+            <w:r>
+              <w:rPr>
+                <w:rFonts w:ascii="Calibri" w:hAnsi="Calibri"/>
+                <w:b w:val="0"/>
+                <w:i w:val="0"/>
+                <w:sz w:val="20"/>
+              </w:rPr>
+              <w:t>[ex.: 80%]</w:t>
+            </w:r>
+          </w:p>
+        </w:tc>
+        <w:tc>
+          <w:tcPr>
+            <w:tcW w:type="dxa" w:w="1484"/>
+            <w:tcMar>
+              <w:top w:w="60" w:type="dxa"/>
+              <w:bottom w:w="60" w:type="dxa"/>
+              <w:left w:w="100" w:type="dxa"/>
+              <w:right w:w="100" w:type="dxa"/>
+            </w:tcMar>
+          </w:tcPr>
+          <w:p>
+            <w:pPr>
+              <w:spacing w:before="40" w:after="40"/>
+            </w:pPr>
+            <w:r>
+              <w:rPr>
+                <w:rFonts w:ascii="Calibri" w:hAnsi="Calibri"/>
+                <w:b w:val="0"/>
+                <w:i w:val="0"/>
+                <w:sz w:val="20"/>
+              </w:rPr>
+              <w:t>[ex.: 56 h]</w:t>
+            </w:r>
+          </w:p>
+        </w:tc>
+        <w:tc>
+          <w:tcPr>
+            <w:tcW w:type="dxa" w:w="1484"/>
+            <w:tcMar>
+              <w:top w:w="60" w:type="dxa"/>
+              <w:bottom w:w="60" w:type="dxa"/>
+              <w:left w:w="100" w:type="dxa"/>
+              <w:right w:w="100" w:type="dxa"/>
+            </w:tcMar>
+          </w:tcPr>
+          <w:p>
+            <w:pPr>
+              <w:spacing w:before="40" w:after="40"/>
+            </w:pPr>
+            <w:r>
+              <w:rPr>
+                <w:rFonts w:ascii="Calibri" w:hAnsi="Calibri"/>
+                <w:b w:val="0"/>
+                <w:i w:val="0"/>
+                <w:sz w:val="20"/>
+              </w:rPr>
+              <w:t>[n]</w:t>
+            </w:r>
+          </w:p>
+        </w:tc>
+        <w:tc>
+          <w:tcPr>
+            <w:tcW w:type="dxa" w:w="1484"/>
+            <w:tcMar>
+              <w:top w:w="60" w:type="dxa"/>
+              <w:bottom w:w="60" w:type="dxa"/>
+              <w:left w:w="100" w:type="dxa"/>
+              <w:right w:w="100" w:type="dxa"/>
+            </w:tcMar>
+          </w:tcPr>
+          <w:p>
+            <w:pPr>
+              <w:spacing w:before="40" w:after="40"/>
+            </w:pPr>
+            <w:r>
+              <w:rPr>
+                <w:rFonts w:ascii="Calibri" w:hAnsi="Calibri"/>
+                <w:b w:val="0"/>
+                <w:i w:val="0"/>
+                <w:sz w:val="20"/>
+              </w:rPr>
+              <w:t>[total]</w:t>
+            </w:r>
+          </w:p>
+        </w:tc>
+      </w:tr>
+      <w:tr>
+        <w:trPr>
+          <w:cantSplit w:val="1"/>
+        </w:trPr>
+        <w:tc>
+          <w:tcPr>
+            <w:tcW w:type="dxa" w:w="1484"/>
+            <w:tcMar>
+              <w:top w:w="60" w:type="dxa"/>
+              <w:bottom w:w="60" w:type="dxa"/>
+              <w:left w:w="100" w:type="dxa"/>
+              <w:right w:w="100" w:type="dxa"/>
+            </w:tcMar>
+            <w:shd w:val="clear" w:color="auto" w:fill="EBF5FB"/>
+          </w:tcPr>
+          <w:p>
+            <w:pPr>
+              <w:spacing w:before="40" w:after="40"/>
+            </w:pPr>
+            <w:r>
+              <w:rPr>
+                <w:rFonts w:ascii="Calibri" w:hAnsi="Calibri"/>
+                <w:b w:val="0"/>
+                <w:i w:val="0"/>
+                <w:sz w:val="20"/>
+              </w:rPr>
+              <w:t>DevOps</w:t>
+            </w:r>
+          </w:p>
+        </w:tc>
+        <w:tc>
+          <w:tcPr>
+            <w:tcW w:type="dxa" w:w="1484"/>
+            <w:tcMar>
+              <w:top w:w="60" w:type="dxa"/>
+              <w:bottom w:w="60" w:type="dxa"/>
+              <w:left w:w="100" w:type="dxa"/>
+              <w:right w:w="100" w:type="dxa"/>
+            </w:tcMar>
+            <w:shd w:val="clear" w:color="auto" w:fill="EBF5FB"/>
+          </w:tcPr>
+          <w:p>
+            <w:pPr>
+              <w:spacing w:before="40" w:after="40"/>
+            </w:pPr>
+            <w:r>
+              <w:rPr>
+                <w:rFonts w:ascii="Calibri" w:hAnsi="Calibri"/>
+                <w:b w:val="0"/>
+                <w:i w:val="0"/>
+                <w:sz w:val="20"/>
+              </w:rPr>
+              <w:t>[n]</w:t>
+            </w:r>
+          </w:p>
+        </w:tc>
+        <w:tc>
+          <w:tcPr>
+            <w:tcW w:type="dxa" w:w="1484"/>
+            <w:tcMar>
+              <w:top w:w="60" w:type="dxa"/>
+              <w:bottom w:w="60" w:type="dxa"/>
+              <w:left w:w="100" w:type="dxa"/>
+              <w:right w:w="100" w:type="dxa"/>
+            </w:tcMar>
+            <w:shd w:val="clear" w:color="auto" w:fill="EBF5FB"/>
+          </w:tcPr>
+          <w:p>
+            <w:pPr>
+              <w:spacing w:before="40" w:after="40"/>
+            </w:pPr>
+            <w:r>
+              <w:rPr>
+                <w:rFonts w:ascii="Calibri" w:hAnsi="Calibri"/>
+                <w:b w:val="0"/>
+                <w:i w:val="0"/>
+                <w:sz w:val="20"/>
+              </w:rPr>
+              <w:t>[ex.: 40%]</w:t>
+            </w:r>
+          </w:p>
+        </w:tc>
+        <w:tc>
+          <w:tcPr>
+            <w:tcW w:type="dxa" w:w="1484"/>
+            <w:tcMar>
+              <w:top w:w="60" w:type="dxa"/>
+              <w:bottom w:w="60" w:type="dxa"/>
+              <w:left w:w="100" w:type="dxa"/>
+              <w:right w:w="100" w:type="dxa"/>
+            </w:tcMar>
+            <w:shd w:val="clear" w:color="auto" w:fill="EBF5FB"/>
+          </w:tcPr>
+          <w:p>
+            <w:pPr>
+              <w:spacing w:before="40" w:after="40"/>
+            </w:pPr>
+            <w:r>
+              <w:rPr>
+                <w:rFonts w:ascii="Calibri" w:hAnsi="Calibri"/>
+                <w:b w:val="0"/>
+                <w:i w:val="0"/>
+                <w:sz w:val="20"/>
+              </w:rPr>
+              <w:t>[ex.: 28 h]</w:t>
+            </w:r>
+          </w:p>
+        </w:tc>
+        <w:tc>
+          <w:tcPr>
+            <w:tcW w:type="dxa" w:w="1484"/>
+            <w:tcMar>
+              <w:top w:w="60" w:type="dxa"/>
+              <w:bottom w:w="60" w:type="dxa"/>
+              <w:left w:w="100" w:type="dxa"/>
+              <w:right w:w="100" w:type="dxa"/>
+            </w:tcMar>
+            <w:shd w:val="clear" w:color="auto" w:fill="EBF5FB"/>
+          </w:tcPr>
+          <w:p>
+            <w:pPr>
+              <w:spacing w:before="40" w:after="40"/>
+            </w:pPr>
+            <w:r>
+              <w:rPr>
+                <w:rFonts w:ascii="Calibri" w:hAnsi="Calibri"/>
+                <w:b w:val="0"/>
+                <w:i w:val="0"/>
+                <w:sz w:val="20"/>
+              </w:rPr>
+              <w:t>[n]</w:t>
+            </w:r>
+          </w:p>
+        </w:tc>
+        <w:tc>
+          <w:tcPr>
+            <w:tcW w:type="dxa" w:w="1484"/>
+            <w:tcMar>
+              <w:top w:w="60" w:type="dxa"/>
+              <w:bottom w:w="60" w:type="dxa"/>
+              <w:left w:w="100" w:type="dxa"/>
+              <w:right w:w="100" w:type="dxa"/>
+            </w:tcMar>
+            <w:shd w:val="clear" w:color="auto" w:fill="EBF5FB"/>
+          </w:tcPr>
+          <w:p>
+            <w:pPr>
+              <w:spacing w:before="40" w:after="40"/>
+            </w:pPr>
+            <w:r>
+              <w:rPr>
+                <w:rFonts w:ascii="Calibri" w:hAnsi="Calibri"/>
+                <w:b w:val="0"/>
+                <w:i w:val="0"/>
+                <w:sz w:val="20"/>
+              </w:rPr>
+              <w:t>[total]</w:t>
+            </w:r>
+          </w:p>
+        </w:tc>
+      </w:tr>
+      <w:tr>
+        <w:trPr>
+          <w:cantSplit w:val="1"/>
+        </w:trPr>
+        <w:tc>
+          <w:tcPr>
+            <w:tcW w:type="dxa" w:w="1484"/>
+            <w:tcMar>
+              <w:top w:w="60" w:type="dxa"/>
+              <w:bottom w:w="60" w:type="dxa"/>
+              <w:left w:w="100" w:type="dxa"/>
+              <w:right w:w="100" w:type="dxa"/>
+            </w:tcMar>
+          </w:tcPr>
+          <w:p>
+            <w:pPr>
+              <w:spacing w:before="40" w:after="40"/>
+            </w:pPr>
+            <w:r>
+              <w:rPr>
+                <w:rFonts w:ascii="Calibri" w:hAnsi="Calibri"/>
+                <w:b/>
+                <w:i w:val="0"/>
+                <w:sz w:val="20"/>
+              </w:rPr>
+              <w:t>Total</w:t>
+            </w:r>
+          </w:p>
+        </w:tc>
+        <w:tc>
+          <w:tcPr>
+            <w:tcW w:type="dxa" w:w="1484"/>
+            <w:tcMar>
+              <w:top w:w="60" w:type="dxa"/>
+              <w:bottom w:w="60" w:type="dxa"/>
+              <w:left w:w="100" w:type="dxa"/>
+              <w:right w:w="100" w:type="dxa"/>
+            </w:tcMar>
+          </w:tcPr>
+          <w:p>
+            <w:pPr>
+              <w:spacing w:before="40" w:after="40"/>
+            </w:pPr>
+            <w:r>
+              <w:rPr>
+                <w:rFonts w:ascii="Calibri" w:hAnsi="Calibri"/>
+                <w:b/>
+                <w:i w:val="0"/>
+                <w:sz w:val="20"/>
+              </w:rPr>
+              <w:t>[soma]</w:t>
+            </w:r>
+          </w:p>
+        </w:tc>
+        <w:tc>
+          <w:tcPr>
+            <w:tcW w:type="dxa" w:w="1484"/>
+            <w:tcMar>
+              <w:top w:w="60" w:type="dxa"/>
+              <w:bottom w:w="60" w:type="dxa"/>
+              <w:left w:w="100" w:type="dxa"/>
+              <w:right w:w="100" w:type="dxa"/>
+            </w:tcMar>
+          </w:tcPr>
+          <w:p>
+            <w:pPr>
+              <w:spacing w:before="40" w:after="40"/>
+            </w:pPr>
+          </w:p>
+        </w:tc>
+        <w:tc>
+          <w:tcPr>
+            <w:tcW w:type="dxa" w:w="1484"/>
+            <w:tcMar>
+              <w:top w:w="60" w:type="dxa"/>
+              <w:bottom w:w="60" w:type="dxa"/>
+              <w:left w:w="100" w:type="dxa"/>
+              <w:right w:w="100" w:type="dxa"/>
+            </w:tcMar>
+          </w:tcPr>
+          <w:p>
+            <w:pPr>
+              <w:spacing w:before="40" w:after="40"/>
+            </w:pPr>
+          </w:p>
+        </w:tc>
+        <w:tc>
+          <w:tcPr>
+            <w:tcW w:type="dxa" w:w="1484"/>
+            <w:tcMar>
+              <w:top w:w="60" w:type="dxa"/>
+              <w:bottom w:w="60" w:type="dxa"/>
+              <w:left w:w="100" w:type="dxa"/>
+              <w:right w:w="100" w:type="dxa"/>
+            </w:tcMar>
+          </w:tcPr>
+          <w:p>
+            <w:pPr>
+              <w:spacing w:before="40" w:after="40"/>
+            </w:pPr>
+          </w:p>
+        </w:tc>
+        <w:tc>
+          <w:tcPr>
+            <w:tcW w:type="dxa" w:w="1484"/>
+            <w:tcMar>
+              <w:top w:w="60" w:type="dxa"/>
+              <w:bottom w:w="60" w:type="dxa"/>
+              <w:left w:w="100" w:type="dxa"/>
+              <w:right w:w="100" w:type="dxa"/>
+            </w:tcMar>
+          </w:tcPr>
+          <w:p>
+            <w:pPr>
+              <w:spacing w:before="40" w:after="40"/>
+            </w:pPr>
+          </w:p>
+        </w:tc>
+      </w:tr>
+    </w:tbl>
+    <w:p>
+      <w:pPr>
+        <w:spacing w:before="0" w:after="160"/>
+      </w:pPr>
+    </w:p>
+    <w:p>
+      <w:pPr>
+        <w:spacing w:before="40" w:after="120"/>
+        <w:ind w:left="454"/>
+        <w:pBdr>
+          <w:left w:val="single" w:sz="12" w:space="8" w:color="003366"/>
+        </w:pBdr>
+      </w:pPr>
+      <w:r>
+        <w:rPr>
+          <w:rFonts w:ascii="Calibri" w:hAnsi="Calibri"/>
+          <w:b w:val="0"/>
+          <w:i/>
+          <w:color w:val="1A5276"/>
+          <w:sz w:val="22"/>
+        </w:rPr>
+        <w:t>Referência de cálculo:</w:t>
+      </w:r>
+      <w:r>
+        <w:rPr>
+          <w:rFonts w:ascii="Calibri" w:hAnsi="Calibri"/>
+          <w:b w:val="0"/>
+          <w:i w:val="0"/>
+          <w:color w:val="1A5276"/>
+          <w:sz w:val="22"/>
+        </w:rPr>
+        <w:t xml:space="preserve"> h efetivas/sprint = 70 h × (% dedicação). Ex.: Dev 100% = 70 h/sprint; GP 60% = 42 h/sprint. Papéis não aplicáveis ao projeto devem ser removidos da tabela.</w:t>
+      </w:r>
+    </w:p>
+    <w:p>
+      <w:pPr>
+        <w:pStyle w:val="Heading1"/>
+        <w:keepNext/>
+        <w:keepLines/>
+        <w:pBdr>
+          <w:bottom w:val="single" w:sz="4" w:space="2" w:color="D6E4F0"/>
+        </w:pBdr>
+      </w:pPr>
+      <w:r>
+        <w:t>5. Cronograma, marcos e orçamento (GPR 5)</w:t>
+      </w:r>
+    </w:p>
+    <w:p>
+      <w:pPr>
+        <w:spacing w:before="0" w:after="120"/>
+      </w:pPr>
+      <w:r>
+        <w:rPr>
+          <w:rFonts w:ascii="Calibri" w:hAnsi="Calibri"/>
+          <w:b w:val="0"/>
+          <w:i/>
+          <w:sz w:val="22"/>
+        </w:rPr>
+        <w:t>[Liste os marcos do projeto e as sprints previstas. O orçamento total de horas é derivado da tabela acima.]</w:t>
+      </w:r>
+    </w:p>
+    <w:p>
+      <w:pPr>
+        <w:spacing w:before="0" w:after="120"/>
+      </w:pPr>
+      <w:r>
+        <w:rPr>
+          <w:rFonts w:ascii="Calibri" w:hAnsi="Calibri"/>
+          <w:b/>
+          <w:i w:val="0"/>
+          <w:sz w:val="22"/>
+        </w:rPr>
+        <w:t>Marcos</w:t>
       </w:r>
     </w:p>
     <w:tbl>
@@ -1609,6 +2860,271 @@
                 <w:sz w:val="20"/>
               </w:rPr>
               <w:t>[data]</w:t>
+            </w:r>
+          </w:p>
+        </w:tc>
+      </w:tr>
+    </w:tbl>
+    <w:p>
+      <w:pPr>
+        <w:spacing w:before="0" w:after="160"/>
+      </w:pPr>
+    </w:p>
+    <w:p>
+      <w:pPr>
+        <w:spacing w:before="0" w:after="120"/>
+      </w:pPr>
+      <w:r>
+        <w:rPr>
+          <w:rFonts w:ascii="Calibri" w:hAnsi="Calibri"/>
+          <w:b/>
+          <w:i w:val="0"/>
+          <w:sz w:val="22"/>
+        </w:rPr>
+        <w:t>Orçamento total do projeto</w:t>
+      </w:r>
+    </w:p>
+    <w:tbl>
+      <w:tblPr>
+        <w:tblW w:type="auto" w:w="0"/>
+        <w:tblLook w:firstColumn="1" w:firstRow="1" w:lastColumn="0" w:lastRow="0" w:noHBand="0" w:noVBand="1" w:val="04A0"/>
+        <w:tblBorders>
+          <w:top w:val="single" w:sz="4" w:space="0" w:color="003366"/>
+          <w:left w:val="single" w:sz="4" w:space="0" w:color="003366"/>
+          <w:bottom w:val="single" w:sz="4" w:space="0" w:color="003366"/>
+          <w:right w:val="single" w:sz="4" w:space="0" w:color="003366"/>
+          <w:insideH w:val="single" w:sz="4" w:space="0" w:color="003366"/>
+          <w:insideV w:val="single" w:sz="4" w:space="0" w:color="003366"/>
+        </w:tblBorders>
+      </w:tblPr>
+      <w:tblGrid>
+        <w:gridCol w:w="4451"/>
+        <w:gridCol w:w="4451"/>
+      </w:tblGrid>
+      <w:tr>
+        <w:trPr>
+          <w:cantSplit w:val="1"/>
+        </w:trPr>
+        <w:tc>
+          <w:tcPr>
+            <w:tcW w:type="dxa" w:w="4451"/>
+            <w:tcMar>
+              <w:top w:w="60" w:type="dxa"/>
+              <w:bottom w:w="60" w:type="dxa"/>
+              <w:left w:w="100" w:type="dxa"/>
+              <w:right w:w="100" w:type="dxa"/>
+            </w:tcMar>
+            <w:shd w:val="clear" w:color="auto" w:fill="003366"/>
+          </w:tcPr>
+          <w:p>
+            <w:pPr>
+              <w:spacing w:before="40" w:after="40"/>
+            </w:pPr>
+            <w:r>
+              <w:rPr>
+                <w:rFonts w:ascii="Calibri" w:hAnsi="Calibri"/>
+                <w:b/>
+                <w:i w:val="0"/>
+                <w:color w:val="FFFFFF"/>
+                <w:sz w:val="20"/>
+              </w:rPr>
+              <w:t>Item</w:t>
+            </w:r>
+          </w:p>
+        </w:tc>
+        <w:tc>
+          <w:tcPr>
+            <w:tcW w:type="dxa" w:w="4451"/>
+            <w:tcMar>
+              <w:top w:w="60" w:type="dxa"/>
+              <w:bottom w:w="60" w:type="dxa"/>
+              <w:left w:w="100" w:type="dxa"/>
+              <w:right w:w="100" w:type="dxa"/>
+            </w:tcMar>
+            <w:shd w:val="clear" w:color="auto" w:fill="003366"/>
+          </w:tcPr>
+          <w:p>
+            <w:pPr>
+              <w:spacing w:before="40" w:after="40"/>
+            </w:pPr>
+            <w:r>
+              <w:rPr>
+                <w:rFonts w:ascii="Calibri" w:hAnsi="Calibri"/>
+                <w:b/>
+                <w:i w:val="0"/>
+                <w:color w:val="FFFFFF"/>
+                <w:sz w:val="20"/>
+              </w:rPr>
+              <w:t>Valor</w:t>
+            </w:r>
+          </w:p>
+        </w:tc>
+      </w:tr>
+      <w:tr>
+        <w:trPr>
+          <w:cantSplit w:val="1"/>
+        </w:trPr>
+        <w:tc>
+          <w:tcPr>
+            <w:tcW w:type="dxa" w:w="4451"/>
+            <w:tcMar>
+              <w:top w:w="60" w:type="dxa"/>
+              <w:bottom w:w="60" w:type="dxa"/>
+              <w:left w:w="100" w:type="dxa"/>
+              <w:right w:w="100" w:type="dxa"/>
+            </w:tcMar>
+            <w:shd w:val="clear" w:color="auto" w:fill="EBF5FB"/>
+          </w:tcPr>
+          <w:p>
+            <w:pPr>
+              <w:spacing w:before="40" w:after="40"/>
+            </w:pPr>
+            <w:r>
+              <w:rPr>
+                <w:rFonts w:ascii="Calibri" w:hAnsi="Calibri"/>
+                <w:b w:val="0"/>
+                <w:i w:val="0"/>
+                <w:sz w:val="20"/>
+              </w:rPr>
+              <w:t>Horas totais estimadas</w:t>
+            </w:r>
+          </w:p>
+        </w:tc>
+        <w:tc>
+          <w:tcPr>
+            <w:tcW w:type="dxa" w:w="4451"/>
+            <w:tcMar>
+              <w:top w:w="60" w:type="dxa"/>
+              <w:bottom w:w="60" w:type="dxa"/>
+              <w:left w:w="100" w:type="dxa"/>
+              <w:right w:w="100" w:type="dxa"/>
+            </w:tcMar>
+            <w:shd w:val="clear" w:color="auto" w:fill="EBF5FB"/>
+          </w:tcPr>
+          <w:p>
+            <w:pPr>
+              <w:spacing w:before="40" w:after="40"/>
+            </w:pPr>
+            <w:r>
+              <w:rPr>
+                <w:rFonts w:ascii="Calibri" w:hAnsi="Calibri"/>
+                <w:b w:val="0"/>
+                <w:i w:val="0"/>
+                <w:sz w:val="20"/>
+              </w:rPr>
+              <w:t>[soma da tabela §4]</w:t>
+            </w:r>
+          </w:p>
+        </w:tc>
+      </w:tr>
+      <w:tr>
+        <w:trPr>
+          <w:cantSplit w:val="1"/>
+        </w:trPr>
+        <w:tc>
+          <w:tcPr>
+            <w:tcW w:type="dxa" w:w="4451"/>
+            <w:tcMar>
+              <w:top w:w="60" w:type="dxa"/>
+              <w:bottom w:w="60" w:type="dxa"/>
+              <w:left w:w="100" w:type="dxa"/>
+              <w:right w:w="100" w:type="dxa"/>
+            </w:tcMar>
+          </w:tcPr>
+          <w:p>
+            <w:pPr>
+              <w:spacing w:before="40" w:after="40"/>
+            </w:pPr>
+            <w:r>
+              <w:rPr>
+                <w:rFonts w:ascii="Calibri" w:hAnsi="Calibri"/>
+                <w:b w:val="0"/>
+                <w:i w:val="0"/>
+                <w:sz w:val="20"/>
+              </w:rPr>
+              <w:t>Período (início–fim)</w:t>
+            </w:r>
+          </w:p>
+        </w:tc>
+        <w:tc>
+          <w:tcPr>
+            <w:tcW w:type="dxa" w:w="4451"/>
+            <w:tcMar>
+              <w:top w:w="60" w:type="dxa"/>
+              <w:bottom w:w="60" w:type="dxa"/>
+              <w:left w:w="100" w:type="dxa"/>
+              <w:right w:w="100" w:type="dxa"/>
+            </w:tcMar>
+          </w:tcPr>
+          <w:p>
+            <w:pPr>
+              <w:spacing w:before="40" w:after="40"/>
+            </w:pPr>
+            <w:r>
+              <w:rPr>
+                <w:rFonts w:ascii="Calibri" w:hAnsi="Calibri"/>
+                <w:b w:val="0"/>
+                <w:i w:val="0"/>
+                <w:sz w:val="20"/>
+              </w:rPr>
+              <w:t>[data] a [data]</w:t>
+            </w:r>
+          </w:p>
+        </w:tc>
+      </w:tr>
+      <w:tr>
+        <w:trPr>
+          <w:cantSplit w:val="1"/>
+        </w:trPr>
+        <w:tc>
+          <w:tcPr>
+            <w:tcW w:type="dxa" w:w="4451"/>
+            <w:tcMar>
+              <w:top w:w="60" w:type="dxa"/>
+              <w:bottom w:w="60" w:type="dxa"/>
+              <w:left w:w="100" w:type="dxa"/>
+              <w:right w:w="100" w:type="dxa"/>
+            </w:tcMar>
+            <w:shd w:val="clear" w:color="auto" w:fill="EBF5FB"/>
+          </w:tcPr>
+          <w:p>
+            <w:pPr>
+              <w:spacing w:before="40" w:after="40"/>
+            </w:pPr>
+            <w:r>
+              <w:rPr>
+                <w:rFonts w:ascii="Calibri" w:hAnsi="Calibri"/>
+                <w:b w:val="0"/>
+                <w:i w:val="0"/>
+                <w:sz w:val="20"/>
+              </w:rPr>
+              <w:t>Sprints</w:t>
+            </w:r>
+          </w:p>
+        </w:tc>
+        <w:tc>
+          <w:tcPr>
+            <w:tcW w:type="dxa" w:w="4451"/>
+            <w:tcMar>
+              <w:top w:w="60" w:type="dxa"/>
+              <w:bottom w:w="60" w:type="dxa"/>
+              <w:left w:w="100" w:type="dxa"/>
+              <w:right w:w="100" w:type="dxa"/>
+            </w:tcMar>
+            <w:shd w:val="clear" w:color="auto" w:fill="EBF5FB"/>
+          </w:tcPr>
+          <w:p>
+            <w:pPr>
+              <w:spacing w:before="40" w:after="40"/>
+            </w:pPr>
+            <w:r>
+              <w:rPr>
+                <w:rFonts w:ascii="Calibri" w:hAnsi="Calibri"/>
+                <w:b w:val="0"/>
+                <w:i w:val="0"/>
+                <w:sz w:val="20"/>
+              </w:rPr>
+              <w:t>[nº] sprints de 2 semanas</w:t>
             </w:r>
           </w:p>
         </w:tc>
@@ -2934,6 +4450,365 @@
         <w:spacing w:before="0" w:after="160"/>
       </w:pPr>
     </w:p>
+    <w:p>
+      <w:pPr>
+        <w:pStyle w:val="Heading1"/>
+        <w:keepNext/>
+        <w:keepLines/>
+        <w:pBdr>
+          <w:bottom w:val="single" w:sz="4" w:space="2" w:color="D6E4F0"/>
+        </w:pBdr>
+      </w:pPr>
+      <w:r>
+        <w:t>Histórico de revisões do template</w:t>
+      </w:r>
+    </w:p>
+    <w:tbl>
+      <w:tblPr>
+        <w:tblW w:type="auto" w:w="0"/>
+        <w:tblLook w:firstColumn="1" w:firstRow="1" w:lastColumn="0" w:lastRow="0" w:noHBand="0" w:noVBand="1" w:val="04A0"/>
+        <w:tblBorders>
+          <w:top w:val="single" w:sz="4" w:space="0" w:color="AAAAAA"/>
+          <w:left w:val="single" w:sz="4" w:space="0" w:color="AAAAAA"/>
+          <w:bottom w:val="single" w:sz="4" w:space="0" w:color="AAAAAA"/>
+          <w:right w:val="single" w:sz="4" w:space="0" w:color="AAAAAA"/>
+          <w:insideH w:val="single" w:sz="4" w:space="0" w:color="AAAAAA"/>
+          <w:insideV w:val="single" w:sz="4" w:space="0" w:color="AAAAAA"/>
+        </w:tblBorders>
+      </w:tblPr>
+      <w:tblGrid>
+        <w:gridCol w:w="2225"/>
+        <w:gridCol w:w="2225"/>
+        <w:gridCol w:w="2225"/>
+        <w:gridCol w:w="2225"/>
+      </w:tblGrid>
+      <w:tr>
+        <w:trPr>
+          <w:cantSplit w:val="1"/>
+        </w:trPr>
+        <w:tc>
+          <w:tcPr>
+            <w:tcW w:type="dxa" w:w="2225"/>
+            <w:tcMar>
+              <w:top w:w="60" w:type="dxa"/>
+              <w:bottom w:w="60" w:type="dxa"/>
+              <w:left w:w="100" w:type="dxa"/>
+              <w:right w:w="100" w:type="dxa"/>
+            </w:tcMar>
+            <w:shd w:val="clear" w:color="auto" w:fill="D6E4F0"/>
+          </w:tcPr>
+          <w:p>
+            <w:pPr>
+              <w:spacing w:before="40" w:after="40"/>
+            </w:pPr>
+            <w:r>
+              <w:rPr>
+                <w:rFonts w:ascii="Calibri" w:hAnsi="Calibri"/>
+                <w:b/>
+                <w:i w:val="0"/>
+                <w:sz w:val="20"/>
+              </w:rPr>
+              <w:t>Versão</w:t>
+            </w:r>
+          </w:p>
+        </w:tc>
+        <w:tc>
+          <w:tcPr>
+            <w:tcW w:type="dxa" w:w="2225"/>
+            <w:tcMar>
+              <w:top w:w="60" w:type="dxa"/>
+              <w:bottom w:w="60" w:type="dxa"/>
+              <w:left w:w="100" w:type="dxa"/>
+              <w:right w:w="100" w:type="dxa"/>
+            </w:tcMar>
+            <w:shd w:val="clear" w:color="auto" w:fill="D6E4F0"/>
+          </w:tcPr>
+          <w:p>
+            <w:pPr>
+              <w:spacing w:before="40" w:after="40"/>
+            </w:pPr>
+            <w:r>
+              <w:rPr>
+                <w:rFonts w:ascii="Calibri" w:hAnsi="Calibri"/>
+                <w:b/>
+                <w:i w:val="0"/>
+                <w:sz w:val="20"/>
+              </w:rPr>
+              <w:t>Data</w:t>
+            </w:r>
+          </w:p>
+        </w:tc>
+        <w:tc>
+          <w:tcPr>
+            <w:tcW w:type="dxa" w:w="2225"/>
+            <w:tcMar>
+              <w:top w:w="60" w:type="dxa"/>
+              <w:bottom w:w="60" w:type="dxa"/>
+              <w:left w:w="100" w:type="dxa"/>
+              <w:right w:w="100" w:type="dxa"/>
+            </w:tcMar>
+            <w:shd w:val="clear" w:color="auto" w:fill="D6E4F0"/>
+          </w:tcPr>
+          <w:p>
+            <w:pPr>
+              <w:spacing w:before="40" w:after="40"/>
+            </w:pPr>
+            <w:r>
+              <w:rPr>
+                <w:rFonts w:ascii="Calibri" w:hAnsi="Calibri"/>
+                <w:b/>
+                <w:i w:val="0"/>
+                <w:sz w:val="20"/>
+              </w:rPr>
+              <w:t>Autor</w:t>
+            </w:r>
+          </w:p>
+        </w:tc>
+        <w:tc>
+          <w:tcPr>
+            <w:tcW w:type="dxa" w:w="2225"/>
+            <w:tcMar>
+              <w:top w:w="60" w:type="dxa"/>
+              <w:bottom w:w="60" w:type="dxa"/>
+              <w:left w:w="100" w:type="dxa"/>
+              <w:right w:w="100" w:type="dxa"/>
+            </w:tcMar>
+            <w:shd w:val="clear" w:color="auto" w:fill="D6E4F0"/>
+          </w:tcPr>
+          <w:p>
+            <w:pPr>
+              <w:spacing w:before="40" w:after="40"/>
+            </w:pPr>
+            <w:r>
+              <w:rPr>
+                <w:rFonts w:ascii="Calibri" w:hAnsi="Calibri"/>
+                <w:b/>
+                <w:i w:val="0"/>
+                <w:sz w:val="20"/>
+              </w:rPr>
+              <w:t>Descrição</w:t>
+            </w:r>
+          </w:p>
+        </w:tc>
+      </w:tr>
+      <w:tr>
+        <w:trPr>
+          <w:cantSplit w:val="1"/>
+        </w:trPr>
+        <w:tc>
+          <w:tcPr>
+            <w:tcW w:type="dxa" w:w="2225"/>
+            <w:tcMar>
+              <w:top w:w="60" w:type="dxa"/>
+              <w:bottom w:w="60" w:type="dxa"/>
+              <w:left w:w="100" w:type="dxa"/>
+              <w:right w:w="100" w:type="dxa"/>
+            </w:tcMar>
+            <w:shd w:val="clear" w:color="auto" w:fill="F0F4F8"/>
+          </w:tcPr>
+          <w:p>
+            <w:pPr>
+              <w:spacing w:before="40" w:after="40"/>
+            </w:pPr>
+            <w:r>
+              <w:rPr>
+                <w:rFonts w:ascii="Calibri" w:hAnsi="Calibri"/>
+                <w:b/>
+                <w:i w:val="0"/>
+                <w:sz w:val="20"/>
+              </w:rPr>
+              <w:t>1.0</w:t>
+            </w:r>
+          </w:p>
+        </w:tc>
+        <w:tc>
+          <w:tcPr>
+            <w:tcW w:type="dxa" w:w="2225"/>
+            <w:tcMar>
+              <w:top w:w="60" w:type="dxa"/>
+              <w:bottom w:w="60" w:type="dxa"/>
+              <w:left w:w="100" w:type="dxa"/>
+              <w:right w:w="100" w:type="dxa"/>
+            </w:tcMar>
+          </w:tcPr>
+          <w:p>
+            <w:pPr>
+              <w:spacing w:before="40" w:after="40"/>
+            </w:pPr>
+            <w:r>
+              <w:rPr>
+                <w:rFonts w:ascii="Calibri" w:hAnsi="Calibri"/>
+                <w:b w:val="0"/>
+                <w:i w:val="0"/>
+                <w:sz w:val="20"/>
+              </w:rPr>
+              <w:t>10/09/2025</w:t>
+            </w:r>
+          </w:p>
+        </w:tc>
+        <w:tc>
+          <w:tcPr>
+            <w:tcW w:type="dxa" w:w="2225"/>
+            <w:tcMar>
+              <w:top w:w="60" w:type="dxa"/>
+              <w:bottom w:w="60" w:type="dxa"/>
+              <w:left w:w="100" w:type="dxa"/>
+              <w:right w:w="100" w:type="dxa"/>
+            </w:tcMar>
+          </w:tcPr>
+          <w:p>
+            <w:pPr>
+              <w:spacing w:before="40" w:after="40"/>
+            </w:pPr>
+            <w:r>
+              <w:rPr>
+                <w:rFonts w:ascii="Calibri" w:hAnsi="Calibri"/>
+                <w:b w:val="0"/>
+                <w:i w:val="0"/>
+                <w:sz w:val="20"/>
+              </w:rPr>
+              <w:t>Time de Melhoria Contínua</w:t>
+            </w:r>
+          </w:p>
+        </w:tc>
+        <w:tc>
+          <w:tcPr>
+            <w:tcW w:type="dxa" w:w="2225"/>
+            <w:tcMar>
+              <w:top w:w="60" w:type="dxa"/>
+              <w:bottom w:w="60" w:type="dxa"/>
+              <w:left w:w="100" w:type="dxa"/>
+              <w:right w:w="100" w:type="dxa"/>
+            </w:tcMar>
+          </w:tcPr>
+          <w:p>
+            <w:pPr>
+              <w:spacing w:before="40" w:after="40"/>
+            </w:pPr>
+            <w:r>
+              <w:rPr>
+                <w:rFonts w:ascii="Calibri" w:hAnsi="Calibri"/>
+                <w:b w:val="0"/>
+                <w:i w:val="0"/>
+                <w:sz w:val="20"/>
+              </w:rPr>
+              <w:t>Versão inicial do template de plano de projeto</w:t>
+            </w:r>
+          </w:p>
+        </w:tc>
+      </w:tr>
+      <w:tr>
+        <w:trPr>
+          <w:cantSplit w:val="1"/>
+        </w:trPr>
+        <w:tc>
+          <w:tcPr>
+            <w:tcW w:type="dxa" w:w="2225"/>
+            <w:tcMar>
+              <w:top w:w="60" w:type="dxa"/>
+              <w:bottom w:w="60" w:type="dxa"/>
+              <w:left w:w="100" w:type="dxa"/>
+              <w:right w:w="100" w:type="dxa"/>
+            </w:tcMar>
+            <w:shd w:val="clear" w:color="auto" w:fill="F0F4F8"/>
+          </w:tcPr>
+          <w:p>
+            <w:pPr>
+              <w:spacing w:before="40" w:after="40"/>
+            </w:pPr>
+            <w:r>
+              <w:rPr>
+                <w:rFonts w:ascii="Calibri" w:hAnsi="Calibri"/>
+                <w:b/>
+                <w:i w:val="0"/>
+                <w:sz w:val="20"/>
+              </w:rPr>
+              <w:t>1.1</w:t>
+            </w:r>
+          </w:p>
+        </w:tc>
+        <w:tc>
+          <w:tcPr>
+            <w:tcW w:type="dxa" w:w="2225"/>
+            <w:tcMar>
+              <w:top w:w="60" w:type="dxa"/>
+              <w:bottom w:w="60" w:type="dxa"/>
+              <w:left w:w="100" w:type="dxa"/>
+              <w:right w:w="100" w:type="dxa"/>
+            </w:tcMar>
+          </w:tcPr>
+          <w:p>
+            <w:pPr>
+              <w:spacing w:before="40" w:after="40"/>
+            </w:pPr>
+            <w:r>
+              <w:rPr>
+                <w:rFonts w:ascii="Calibri" w:hAnsi="Calibri"/>
+                <w:b w:val="0"/>
+                <w:i w:val="0"/>
+                <w:sz w:val="20"/>
+              </w:rPr>
+              <w:t>10/06/2026</w:t>
+            </w:r>
+          </w:p>
+        </w:tc>
+        <w:tc>
+          <w:tcPr>
+            <w:tcW w:type="dxa" w:w="2225"/>
+            <w:tcMar>
+              <w:top w:w="60" w:type="dxa"/>
+              <w:bottom w:w="60" w:type="dxa"/>
+              <w:left w:w="100" w:type="dxa"/>
+              <w:right w:w="100" w:type="dxa"/>
+            </w:tcMar>
+          </w:tcPr>
+          <w:p>
+            <w:pPr>
+              <w:spacing w:before="40" w:after="40"/>
+            </w:pPr>
+            <w:r>
+              <w:rPr>
+                <w:rFonts w:ascii="Calibri" w:hAnsi="Calibri"/>
+                <w:b w:val="0"/>
+                <w:i w:val="0"/>
+                <w:sz w:val="20"/>
+              </w:rPr>
+              <w:t>Time de Melhoria Contínua</w:t>
+            </w:r>
+          </w:p>
+        </w:tc>
+        <w:tc>
+          <w:tcPr>
+            <w:tcW w:type="dxa" w:w="2225"/>
+            <w:tcMar>
+              <w:top w:w="60" w:type="dxa"/>
+              <w:bottom w:w="60" w:type="dxa"/>
+              <w:left w:w="100" w:type="dxa"/>
+              <w:right w:w="100" w:type="dxa"/>
+            </w:tcMar>
+          </w:tcPr>
+          <w:p>
+            <w:pPr>
+              <w:spacing w:before="40" w:after="40"/>
+            </w:pPr>
+            <w:r>
+              <w:rPr>
+                <w:rFonts w:ascii="Calibri" w:hAnsi="Calibri"/>
+                <w:b w:val="0"/>
+                <w:i w:val="0"/>
+                <w:sz w:val="20"/>
+              </w:rPr>
+              <w:t>Adição de tabela de orçamento de horas por papel em §4 (GPR 4) e seção de orçamento total em §5 (GPR 5), com referência de capacidade 168 h/mês → 70 h efetivas/sprint/FTE</w:t>
+            </w:r>
+          </w:p>
+        </w:tc>
+      </w:tr>
+    </w:tbl>
+    <w:p>
+      <w:pPr>
+        <w:spacing w:before="0" w:after="160"/>
+      </w:pPr>
+    </w:p>
     <w:sectPr>
       <w:headerReference w:type="default" r:id="rId9"/>
       <w:headerReference w:type="first" r:id="rId10"/>
@@ -3112,7 +4987,7 @@
         <w:color w:val="555555"/>
         <w:sz w:val="18"/>
       </w:rPr>
-      <w:t>Timeware MPS-SW</w:t>
+      <w:t>Evidência de Projeto</w:t>
     </w:r>
   </w:p>
 </w:hdr>

</xml_diff>